<commit_message>
Update core modules: improved momentum monitor, trend predictor, ML training, sentiment analyzer, sector mapper, and dashboard
</commit_message>
<xml_diff>
--- a/INSTRUCTIONS MUST READ.docx
+++ b/INSTRUCTIONS MUST READ.docx
@@ -306,7 +306,17 @@
           <w:szCs w:val="28"/>
           <w:lang w:val="en-US"/>
         </w:rPr>
-        <w:t xml:space="preserve">It is not recommended for the user to do any sort of model retraining or backtesting in the app’s interface, due to the fact that those functions were designated for older versions of the model and will most likely </w:t>
+        <w:t>It is not recommended for the user to</w:t>
+      </w:r>
+      <w:bookmarkStart w:id="0" w:name="_GoBack"/>
+      <w:bookmarkEnd w:id="0"/>
+      <w:r>
+        <w:rPr>
+          <w:sz w:val="28"/>
+          <w:szCs w:val="28"/>
+          <w:lang w:val="en-US"/>
+        </w:rPr>
+        <w:t xml:space="preserve"> do any sort of model retraining or backtesting in the app’s interface, due to the fact that those functions were designated for older versions of the model and will most likely </w:t>
       </w:r>
       <w:r>
         <w:rPr>
@@ -571,7 +581,7 @@
           <w:noProof/>
           <w:sz w:val="28"/>
           <w:szCs w:val="28"/>
-          <w:lang w:val="en-US"/>
+          <w:lang w:eastAsia="en-GB"/>
         </w:rPr>
         <mc:AlternateContent>
           <mc:Choice Requires="wps">
@@ -834,27 +844,7 @@
           <w:szCs w:val="28"/>
           <w:lang w:val="en-US"/>
         </w:rPr>
-        <w:t xml:space="preserve">How to use the </w:t>
-      </w:r>
-      <w:proofErr w:type="gramStart"/>
-      <w:r>
-        <w:rPr>
-          <w:b/>
-          <w:sz w:val="28"/>
-          <w:szCs w:val="28"/>
-          <w:lang w:val="en-US"/>
-        </w:rPr>
-        <w:t>app</w:t>
-      </w:r>
-      <w:proofErr w:type="gramEnd"/>
-      <w:r>
-        <w:rPr>
-          <w:b/>
-          <w:sz w:val="28"/>
-          <w:szCs w:val="28"/>
-          <w:lang w:val="en-US"/>
-        </w:rPr>
-        <w:t xml:space="preserve"> </w:t>
+        <w:t xml:space="preserve">How to use the app </w:t>
       </w:r>
     </w:p>
     <w:p>
@@ -1173,8 +1163,6 @@
         </w:rPr>
         <w:t>PERSONAL analysis is highly recommended, as the app is NOT FINANCIAL ADVICE and should not be treated as such.</w:t>
       </w:r>
-      <w:bookmarkStart w:id="0" w:name="_GoBack"/>
-      <w:bookmarkEnd w:id="0"/>
     </w:p>
     <w:sectPr>
       <w:pgSz w:w="11906" w:h="16838"/>
@@ -2193,7 +2181,7 @@
 </file>
 
 <file path=customXml/itemProps1.xml><?xml version="1.0" encoding="utf-8"?>
-<ds:datastoreItem xmlns:ds="http://schemas.openxmlformats.org/officeDocument/2006/customXml" ds:itemID="{3C19B7FC-FEAD-47EF-AD82-9091C2EAF4B2}">
+<ds:datastoreItem xmlns:ds="http://schemas.openxmlformats.org/officeDocument/2006/customXml" ds:itemID="{955ADD20-6FB7-47F0-8088-2C3A80E5FF5D}">
   <ds:schemaRefs>
     <ds:schemaRef ds:uri="http://schemas.openxmlformats.org/officeDocument/2006/bibliography"/>
   </ds:schemaRefs>

</xml_diff>